<commit_message>
26/04 - IA page esta 100%
</commit_message>
<xml_diff>
--- a/Documentacao/ConnectDocumentacao.docx
+++ b/Documentacao/ConnectDocumentacao.docx
@@ -634,6 +634,13 @@
           <w:szCs w:val="20"/>
         </w:rPr>
         <w:t>a IA</w:t>
+      </w:r>
+      <w:r>
+        <w:rPr>
+          <w:sz w:val="20"/>
+          <w:szCs w:val="20"/>
+        </w:rPr>
+        <w:t>.</w:t>
       </w:r>
     </w:p>
     <w:p>

</xml_diff>